<commit_message>
Eliminar script de zoom
</commit_message>
<xml_diff>
--- a/outputs/Table_1_by disease.docx
+++ b/outputs/Table_1_by disease.docx
@@ -161,6 +161,19 @@
               </w:rPr>
               <w:t xml:space="preserve">N = 1693</w:t>
             </w:r>
+            <w:r>
+              <w:rPr>
+                <w:rFonts w:ascii="Arial" w:hAnsi="Arial" w:eastAsia="Arial" w:cs="Arial"/>
+                <w:i w:val="false"/>
+                <w:b w:val="false"/>
+                <w:u w:val="none"/>
+                <w:vertAlign w:val="superscript"/>
+                <w:sz w:val="18"/>
+                <w:szCs w:val="18"/>
+                <w:color w:val="000000"/>
+              </w:rPr>
+              <w:t xml:space="preserve">1</w:t>
+            </w:r>
           </w:p>
         </w:tc>
         <w:tc>
@@ -249,6 +262,19 @@
               </w:rPr>
               <w:t xml:space="preserve">N = 843 (49.8%)</w:t>
             </w:r>
+            <w:r>
+              <w:rPr>
+                <w:rFonts w:ascii="Arial" w:hAnsi="Arial" w:eastAsia="Arial" w:cs="Arial"/>
+                <w:i w:val="false"/>
+                <w:b w:val="false"/>
+                <w:u w:val="none"/>
+                <w:vertAlign w:val="superscript"/>
+                <w:sz w:val="18"/>
+                <w:szCs w:val="18"/>
+                <w:color w:val="000000"/>
+              </w:rPr>
+              <w:t xml:space="preserve">1</w:t>
+            </w:r>
           </w:p>
         </w:tc>
         <w:tc>
@@ -337,6 +363,19 @@
               </w:rPr>
               <w:t xml:space="preserve">N = 115 (6.8%)</w:t>
             </w:r>
+            <w:r>
+              <w:rPr>
+                <w:rFonts w:ascii="Arial" w:hAnsi="Arial" w:eastAsia="Arial" w:cs="Arial"/>
+                <w:i w:val="false"/>
+                <w:b w:val="false"/>
+                <w:u w:val="none"/>
+                <w:vertAlign w:val="superscript"/>
+                <w:sz w:val="18"/>
+                <w:szCs w:val="18"/>
+                <w:color w:val="000000"/>
+              </w:rPr>
+              <w:t xml:space="preserve">1</w:t>
+            </w:r>
           </w:p>
         </w:tc>
         <w:tc>
@@ -425,6 +464,19 @@
               </w:rPr>
               <w:t xml:space="preserve">N = 542 (32.0%)</w:t>
             </w:r>
+            <w:r>
+              <w:rPr>
+                <w:rFonts w:ascii="Arial" w:hAnsi="Arial" w:eastAsia="Arial" w:cs="Arial"/>
+                <w:i w:val="false"/>
+                <w:b w:val="false"/>
+                <w:u w:val="none"/>
+                <w:vertAlign w:val="superscript"/>
+                <w:sz w:val="18"/>
+                <w:szCs w:val="18"/>
+                <w:color w:val="000000"/>
+              </w:rPr>
+              <w:t xml:space="preserve">1</w:t>
+            </w:r>
           </w:p>
         </w:tc>
         <w:tc>
@@ -513,6 +565,19 @@
               </w:rPr>
               <w:t xml:space="preserve">N = 193 (11.4%)</w:t>
             </w:r>
+            <w:r>
+              <w:rPr>
+                <w:rFonts w:ascii="Arial" w:hAnsi="Arial" w:eastAsia="Arial" w:cs="Arial"/>
+                <w:i w:val="false"/>
+                <w:b w:val="false"/>
+                <w:u w:val="none"/>
+                <w:vertAlign w:val="superscript"/>
+                <w:sz w:val="18"/>
+                <w:szCs w:val="18"/>
+                <w:color w:val="000000"/>
+              </w:rPr>
+              <w:t xml:space="preserve">1</w:t>
+            </w:r>
           </w:p>
         </w:tc>
         <w:tc>
@@ -576,7 +641,72 @@
                 <w:szCs w:val="18"/>
                 <w:color w:val="000000"/>
               </w:rPr>
-              <w:t xml:space="preserve">1</w:t>
+              <w:t xml:space="preserve">2</w:t>
+            </w:r>
+          </w:p>
+        </w:tc>
+        <w:tc>
+          <w:tcPr>
+            <w:tcBorders>
+              <w:bottom w:val="single" w:sz="12" w:space="0" w:color="666666"/>
+              <w:top w:val="single" w:sz="12" w:space="0" w:color="666666"/>
+              <w:left w:val="none" w:sz="0" w:space="0" w:color="000000"/>
+              <w:right w:val="none" w:sz="0" w:space="0" w:color="000000"/>
+            </w:tcBorders>
+            <w:shd w:val="clear" w:color="auto" w:fill="FFFFFF"/>
+            <w:tcMar>
+              <w:top w:w="0" w:type="dxa"/>
+              <w:bottom w:w="0" w:type="dxa"/>
+              <w:left w:w="0" w:type="dxa"/>
+              <w:right w:w="0" w:type="dxa"/>
+            </w:tcMar>
+            <w:vAlign w:val="center"/>
+          </w:tcPr>
+          <w:p>
+            <w:pPr>
+              <w:jc w:val="center"/>
+              <w:pBdr>
+                <w:bottom w:val="none" w:sz="0" w:space="0" w:color="000000"/>
+                <w:top w:val="none" w:sz="0" w:space="0" w:color="000000"/>
+                <w:left w:val="none" w:sz="0" w:space="0" w:color="000000"/>
+                <w:right w:val="none" w:sz="0" w:space="0" w:color="000000"/>
+              </w:pBdr>
+              <w:spacing w:after="10" w:before="10" w:line="240"/>
+              <w:ind w:left="100" w:right="100" w:firstLine="0" w:firstLineChars="0"/>
+              <w:rPr>
+                <w:rFonts w:ascii="Arial" w:hAnsi="Arial" w:eastAsia="Arial" w:cs="Arial"/>
+                <w:i w:val="false"/>
+                <w:b w:val="false"/>
+                <w:u w:val="none"/>
+                <w:sz w:val="18"/>
+                <w:szCs w:val="18"/>
+                <w:color w:val="000000"/>
+              </w:rPr>
+            </w:pPr>
+            <w:r>
+              <w:rPr>
+                <w:rFonts w:ascii="Arial" w:hAnsi="Arial" w:eastAsia="Arial" w:cs="Arial"/>
+                <w:i w:val="false"/>
+                <w:b w:val="true"/>
+                <w:u w:val="none"/>
+                <w:sz w:val="18"/>
+                <w:szCs w:val="18"/>
+                <w:color w:val="000000"/>
+              </w:rPr>
+              <w:t xml:space="preserve">q-value</w:t>
+            </w:r>
+            <w:r>
+              <w:rPr>
+                <w:rFonts w:ascii="Arial" w:hAnsi="Arial" w:eastAsia="Arial" w:cs="Arial"/>
+                <w:i w:val="false"/>
+                <w:b w:val="false"/>
+                <w:u w:val="none"/>
+                <w:vertAlign w:val="superscript"/>
+                <w:sz w:val="18"/>
+                <w:szCs w:val="18"/>
+                <w:color w:val="000000"/>
+              </w:rPr>
+              <w:t xml:space="preserve">3</w:t>
             </w:r>
           </w:p>
         </w:tc>
@@ -634,7 +764,7 @@
                 <w:szCs w:val="18"/>
                 <w:color w:val="000000"/>
               </w:rPr>
-              <w:t xml:space="preserve">Mother's age, Median (Q1, Q3)</w:t>
+              <w:t xml:space="preserve">Mother's age</w:t>
             </w:r>
           </w:p>
         </w:tc>
@@ -947,13 +1077,65 @@
                 <w:color w:val="000000"/>
               </w:rPr>
               <w:t xml:space="preserve">0.607*</w:t>
+            </w:r>
+          </w:p>
+        </w:tc>
+        <w:tc>
+          <w:tcPr>
+            <w:tcBorders>
+              <w:bottom w:val="none" w:sz="0" w:space="0" w:color="000000"/>
+              <w:top w:val="single" w:sz="12" w:space="0" w:color="666666"/>
+              <w:left w:val="none" w:sz="0" w:space="0" w:color="000000"/>
+              <w:right w:val="none" w:sz="0" w:space="0" w:color="000000"/>
+            </w:tcBorders>
+            <w:shd w:val="clear" w:color="auto" w:fill="FFFFFF"/>
+            <w:tcMar>
+              <w:top w:w="0" w:type="dxa"/>
+              <w:bottom w:w="0" w:type="dxa"/>
+              <w:left w:w="0" w:type="dxa"/>
+              <w:right w:w="0" w:type="dxa"/>
+            </w:tcMar>
+            <w:vAlign w:val="top"/>
+          </w:tcPr>
+          <w:p>
+            <w:pPr>
+              <w:jc w:val="center"/>
+              <w:pBdr>
+                <w:bottom w:val="none" w:sz="0" w:space="0" w:color="000000"/>
+                <w:top w:val="none" w:sz="0" w:space="0" w:color="000000"/>
+                <w:left w:val="none" w:sz="0" w:space="0" w:color="000000"/>
+                <w:right w:val="none" w:sz="0" w:space="0" w:color="000000"/>
+              </w:pBdr>
+              <w:spacing w:after="10" w:before="10" w:line="240"/>
+              <w:ind w:left="100" w:right="100" w:firstLine="0" w:firstLineChars="0"/>
+              <w:rPr>
+                <w:rFonts w:ascii="Arial" w:hAnsi="Arial" w:eastAsia="Arial" w:cs="Arial"/>
+                <w:i w:val="false"/>
+                <w:b w:val="false"/>
+                <w:u w:val="none"/>
+                <w:sz w:val="18"/>
+                <w:szCs w:val="18"/>
+                <w:color w:val="000000"/>
+              </w:rPr>
+            </w:pPr>
+            <w:r>
+              <w:rPr>
+                <w:rFonts w:ascii="Arial" w:hAnsi="Arial" w:eastAsia="Arial" w:cs="Arial"/>
+                <w:i w:val="false"/>
+                <w:b w:val="false"/>
+                <w:u w:val="none"/>
+                <w:sz w:val="18"/>
+                <w:szCs w:val="18"/>
+                <w:color w:val="000000"/>
+              </w:rPr>
+              <w:t xml:space="preserve">0.6</w:t>
             </w:r>
           </w:p>
         </w:tc>
       </w:tr>
       <w:tr>
         <w:trPr>
-          <w:trHeight w:val="617" w:hRule="auto"/>
+          <w:trHeight w:val="574" w:hRule="auto"/>
         </w:trPr>
         body 2
         <w:tc>
@@ -1004,7 +1186,7 @@
                 <w:szCs w:val="18"/>
                 <w:color w:val="000000"/>
               </w:rPr>
-              <w:t xml:space="preserve">Sex of children, n (%)</w:t>
+              <w:t xml:space="preserve">Sex of children</w:t>
             </w:r>
           </w:p>
         </w:tc>
@@ -1317,6 +1499,58 @@
                 <w:color w:val="000000"/>
               </w:rPr>
               <w:t xml:space="preserve">&lt;0.001**</w:t>
+            </w:r>
+          </w:p>
+        </w:tc>
+        <w:tc>
+          <w:tcPr>
+            <w:tcBorders>
+              <w:bottom w:val="none" w:sz="0" w:space="0" w:color="000000"/>
+              <w:top w:val="none" w:sz="0" w:space="0" w:color="000000"/>
+              <w:left w:val="none" w:sz="0" w:space="0" w:color="000000"/>
+              <w:right w:val="none" w:sz="0" w:space="0" w:color="000000"/>
+            </w:tcBorders>
+            <w:shd w:val="clear" w:color="auto" w:fill="FFFFFF"/>
+            <w:tcMar>
+              <w:top w:w="0" w:type="dxa"/>
+              <w:bottom w:w="0" w:type="dxa"/>
+              <w:left w:w="0" w:type="dxa"/>
+              <w:right w:w="0" w:type="dxa"/>
+            </w:tcMar>
+            <w:vAlign w:val="top"/>
+          </w:tcPr>
+          <w:p>
+            <w:pPr>
+              <w:jc w:val="center"/>
+              <w:pBdr>
+                <w:bottom w:val="none" w:sz="0" w:space="0" w:color="000000"/>
+                <w:top w:val="none" w:sz="0" w:space="0" w:color="000000"/>
+                <w:left w:val="none" w:sz="0" w:space="0" w:color="000000"/>
+                <w:right w:val="none" w:sz="0" w:space="0" w:color="000000"/>
+              </w:pBdr>
+              <w:spacing w:after="10" w:before="10" w:line="240"/>
+              <w:ind w:left="100" w:right="100" w:firstLine="0" w:firstLineChars="0"/>
+              <w:rPr>
+                <w:rFonts w:ascii="Arial" w:hAnsi="Arial" w:eastAsia="Arial" w:cs="Arial"/>
+                <w:i w:val="false"/>
+                <w:b w:val="false"/>
+                <w:u w:val="none"/>
+                <w:sz w:val="18"/>
+                <w:szCs w:val="18"/>
+                <w:color w:val="000000"/>
+              </w:rPr>
+            </w:pPr>
+            <w:r>
+              <w:rPr>
+                <w:rFonts w:ascii="Arial" w:hAnsi="Arial" w:eastAsia="Arial" w:cs="Arial"/>
+                <w:i w:val="false"/>
+                <w:b w:val="false"/>
+                <w:u w:val="none"/>
+                <w:sz w:val="18"/>
+                <w:szCs w:val="18"/>
+                <w:color w:val="000000"/>
+              </w:rPr>
+              <w:t xml:space="preserve">&lt;0.001</w:t>
             </w:r>
           </w:p>
         </w:tc>
@@ -1690,6 +1924,58 @@
             </w:r>
           </w:p>
         </w:tc>
+        <w:tc>
+          <w:tcPr>
+            <w:tcBorders>
+              <w:bottom w:val="none" w:sz="0" w:space="0" w:color="000000"/>
+              <w:top w:val="none" w:sz="0" w:space="0" w:color="000000"/>
+              <w:left w:val="none" w:sz="0" w:space="0" w:color="000000"/>
+              <w:right w:val="none" w:sz="0" w:space="0" w:color="000000"/>
+            </w:tcBorders>
+            <w:shd w:val="clear" w:color="auto" w:fill="FFFFFF"/>
+            <w:tcMar>
+              <w:top w:w="0" w:type="dxa"/>
+              <w:bottom w:w="0" w:type="dxa"/>
+              <w:left w:w="0" w:type="dxa"/>
+              <w:right w:w="0" w:type="dxa"/>
+            </w:tcMar>
+            <w:vAlign w:val="top"/>
+          </w:tcPr>
+          <w:p>
+            <w:pPr>
+              <w:jc w:val="center"/>
+              <w:pBdr>
+                <w:bottom w:val="none" w:sz="0" w:space="0" w:color="000000"/>
+                <w:top w:val="none" w:sz="0" w:space="0" w:color="000000"/>
+                <w:left w:val="none" w:sz="0" w:space="0" w:color="000000"/>
+                <w:right w:val="none" w:sz="0" w:space="0" w:color="000000"/>
+              </w:pBdr>
+              <w:spacing w:after="10" w:before="10" w:line="240"/>
+              <w:ind w:left="100" w:right="100" w:firstLine="0" w:firstLineChars="0"/>
+              <w:rPr>
+                <w:rFonts w:ascii="Arial" w:hAnsi="Arial" w:eastAsia="Arial" w:cs="Arial"/>
+                <w:i w:val="false"/>
+                <w:b w:val="false"/>
+                <w:u w:val="none"/>
+                <w:sz w:val="18"/>
+                <w:szCs w:val="18"/>
+                <w:color w:val="000000"/>
+              </w:rPr>
+            </w:pPr>
+            <w:r>
+              <w:rPr>
+                <w:rFonts w:ascii="Arial" w:hAnsi="Arial" w:eastAsia="Arial" w:cs="Arial"/>
+                <w:i w:val="false"/>
+                <w:b w:val="false"/>
+                <w:u w:val="none"/>
+                <w:sz w:val="18"/>
+                <w:szCs w:val="18"/>
+                <w:color w:val="000000"/>
+              </w:rPr>
+              <w:t xml:space="preserve"/>
+            </w:r>
+          </w:p>
+        </w:tc>
       </w:tr>
       <w:tr>
         <w:trPr>
@@ -2060,10 +2346,62 @@
             </w:r>
           </w:p>
         </w:tc>
+        <w:tc>
+          <w:tcPr>
+            <w:tcBorders>
+              <w:bottom w:val="none" w:sz="0" w:space="0" w:color="000000"/>
+              <w:top w:val="none" w:sz="0" w:space="0" w:color="000000"/>
+              <w:left w:val="none" w:sz="0" w:space="0" w:color="000000"/>
+              <w:right w:val="none" w:sz="0" w:space="0" w:color="000000"/>
+            </w:tcBorders>
+            <w:shd w:val="clear" w:color="auto" w:fill="FFFFFF"/>
+            <w:tcMar>
+              <w:top w:w="0" w:type="dxa"/>
+              <w:bottom w:w="0" w:type="dxa"/>
+              <w:left w:w="0" w:type="dxa"/>
+              <w:right w:w="0" w:type="dxa"/>
+            </w:tcMar>
+            <w:vAlign w:val="top"/>
+          </w:tcPr>
+          <w:p>
+            <w:pPr>
+              <w:jc w:val="center"/>
+              <w:pBdr>
+                <w:bottom w:val="none" w:sz="0" w:space="0" w:color="000000"/>
+                <w:top w:val="none" w:sz="0" w:space="0" w:color="000000"/>
+                <w:left w:val="none" w:sz="0" w:space="0" w:color="000000"/>
+                <w:right w:val="none" w:sz="0" w:space="0" w:color="000000"/>
+              </w:pBdr>
+              <w:spacing w:after="10" w:before="10" w:line="240"/>
+              <w:ind w:left="100" w:right="100" w:firstLine="0" w:firstLineChars="0"/>
+              <w:rPr>
+                <w:rFonts w:ascii="Arial" w:hAnsi="Arial" w:eastAsia="Arial" w:cs="Arial"/>
+                <w:i w:val="false"/>
+                <w:b w:val="false"/>
+                <w:u w:val="none"/>
+                <w:sz w:val="18"/>
+                <w:szCs w:val="18"/>
+                <w:color w:val="000000"/>
+              </w:rPr>
+            </w:pPr>
+            <w:r>
+              <w:rPr>
+                <w:rFonts w:ascii="Arial" w:hAnsi="Arial" w:eastAsia="Arial" w:cs="Arial"/>
+                <w:i w:val="false"/>
+                <w:b w:val="false"/>
+                <w:u w:val="none"/>
+                <w:sz w:val="18"/>
+                <w:szCs w:val="18"/>
+                <w:color w:val="000000"/>
+              </w:rPr>
+              <w:t xml:space="preserve"/>
+            </w:r>
+          </w:p>
+        </w:tc>
       </w:tr>
       <w:tr>
         <w:trPr>
-          <w:trHeight w:val="617" w:hRule="auto"/>
+          <w:trHeight w:val="574" w:hRule="auto"/>
         </w:trPr>
         body 5
         <w:tc>
@@ -2114,7 +2452,7 @@
                 <w:szCs w:val="18"/>
                 <w:color w:val="000000"/>
               </w:rPr>
-              <w:t xml:space="preserve">Wealth index, n (%)</w:t>
+              <w:t xml:space="preserve">Wealth index</w:t>
             </w:r>
           </w:p>
         </w:tc>
@@ -2427,6 +2765,58 @@
                 <w:color w:val="000000"/>
               </w:rPr>
               <w:t xml:space="preserve">0.021*</w:t>
+            </w:r>
+          </w:p>
+        </w:tc>
+        <w:tc>
+          <w:tcPr>
+            <w:tcBorders>
+              <w:bottom w:val="none" w:sz="0" w:space="0" w:color="000000"/>
+              <w:top w:val="none" w:sz="0" w:space="0" w:color="000000"/>
+              <w:left w:val="none" w:sz="0" w:space="0" w:color="000000"/>
+              <w:right w:val="none" w:sz="0" w:space="0" w:color="000000"/>
+            </w:tcBorders>
+            <w:shd w:val="clear" w:color="auto" w:fill="FFFFFF"/>
+            <w:tcMar>
+              <w:top w:w="0" w:type="dxa"/>
+              <w:bottom w:w="0" w:type="dxa"/>
+              <w:left w:w="0" w:type="dxa"/>
+              <w:right w:w="0" w:type="dxa"/>
+            </w:tcMar>
+            <w:vAlign w:val="top"/>
+          </w:tcPr>
+          <w:p>
+            <w:pPr>
+              <w:jc w:val="center"/>
+              <w:pBdr>
+                <w:bottom w:val="none" w:sz="0" w:space="0" w:color="000000"/>
+                <w:top w:val="none" w:sz="0" w:space="0" w:color="000000"/>
+                <w:left w:val="none" w:sz="0" w:space="0" w:color="000000"/>
+                <w:right w:val="none" w:sz="0" w:space="0" w:color="000000"/>
+              </w:pBdr>
+              <w:spacing w:after="10" w:before="10" w:line="240"/>
+              <w:ind w:left="100" w:right="100" w:firstLine="0" w:firstLineChars="0"/>
+              <w:rPr>
+                <w:rFonts w:ascii="Arial" w:hAnsi="Arial" w:eastAsia="Arial" w:cs="Arial"/>
+                <w:i w:val="false"/>
+                <w:b w:val="false"/>
+                <w:u w:val="none"/>
+                <w:sz w:val="18"/>
+                <w:szCs w:val="18"/>
+                <w:color w:val="000000"/>
+              </w:rPr>
+            </w:pPr>
+            <w:r>
+              <w:rPr>
+                <w:rFonts w:ascii="Arial" w:hAnsi="Arial" w:eastAsia="Arial" w:cs="Arial"/>
+                <w:i w:val="false"/>
+                <w:b w:val="false"/>
+                <w:u w:val="none"/>
+                <w:sz w:val="18"/>
+                <w:szCs w:val="18"/>
+                <w:color w:val="000000"/>
+              </w:rPr>
+              <w:t xml:space="preserve">0.041</w:t>
             </w:r>
           </w:p>
         </w:tc>
@@ -2800,6 +3190,58 @@
             </w:r>
           </w:p>
         </w:tc>
+        <w:tc>
+          <w:tcPr>
+            <w:tcBorders>
+              <w:bottom w:val="none" w:sz="0" w:space="0" w:color="000000"/>
+              <w:top w:val="none" w:sz="0" w:space="0" w:color="000000"/>
+              <w:left w:val="none" w:sz="0" w:space="0" w:color="000000"/>
+              <w:right w:val="none" w:sz="0" w:space="0" w:color="000000"/>
+            </w:tcBorders>
+            <w:shd w:val="clear" w:color="auto" w:fill="FFFFFF"/>
+            <w:tcMar>
+              <w:top w:w="0" w:type="dxa"/>
+              <w:bottom w:w="0" w:type="dxa"/>
+              <w:left w:w="0" w:type="dxa"/>
+              <w:right w:w="0" w:type="dxa"/>
+            </w:tcMar>
+            <w:vAlign w:val="top"/>
+          </w:tcPr>
+          <w:p>
+            <w:pPr>
+              <w:jc w:val="center"/>
+              <w:pBdr>
+                <w:bottom w:val="none" w:sz="0" w:space="0" w:color="000000"/>
+                <w:top w:val="none" w:sz="0" w:space="0" w:color="000000"/>
+                <w:left w:val="none" w:sz="0" w:space="0" w:color="000000"/>
+                <w:right w:val="none" w:sz="0" w:space="0" w:color="000000"/>
+              </w:pBdr>
+              <w:spacing w:after="10" w:before="10" w:line="240"/>
+              <w:ind w:left="100" w:right="100" w:firstLine="0" w:firstLineChars="0"/>
+              <w:rPr>
+                <w:rFonts w:ascii="Arial" w:hAnsi="Arial" w:eastAsia="Arial" w:cs="Arial"/>
+                <w:i w:val="false"/>
+                <w:b w:val="false"/>
+                <w:u w:val="none"/>
+                <w:sz w:val="18"/>
+                <w:szCs w:val="18"/>
+                <w:color w:val="000000"/>
+              </w:rPr>
+            </w:pPr>
+            <w:r>
+              <w:rPr>
+                <w:rFonts w:ascii="Arial" w:hAnsi="Arial" w:eastAsia="Arial" w:cs="Arial"/>
+                <w:i w:val="false"/>
+                <w:b w:val="false"/>
+                <w:u w:val="none"/>
+                <w:sz w:val="18"/>
+                <w:szCs w:val="18"/>
+                <w:color w:val="000000"/>
+              </w:rPr>
+              <w:t xml:space="preserve"/>
+            </w:r>
+          </w:p>
+        </w:tc>
       </w:tr>
       <w:tr>
         <w:trPr>
@@ -3170,6 +3612,58 @@
             </w:r>
           </w:p>
         </w:tc>
+        <w:tc>
+          <w:tcPr>
+            <w:tcBorders>
+              <w:bottom w:val="none" w:sz="0" w:space="0" w:color="000000"/>
+              <w:top w:val="none" w:sz="0" w:space="0" w:color="000000"/>
+              <w:left w:val="none" w:sz="0" w:space="0" w:color="000000"/>
+              <w:right w:val="none" w:sz="0" w:space="0" w:color="000000"/>
+            </w:tcBorders>
+            <w:shd w:val="clear" w:color="auto" w:fill="FFFFFF"/>
+            <w:tcMar>
+              <w:top w:w="0" w:type="dxa"/>
+              <w:bottom w:w="0" w:type="dxa"/>
+              <w:left w:w="0" w:type="dxa"/>
+              <w:right w:w="0" w:type="dxa"/>
+            </w:tcMar>
+            <w:vAlign w:val="top"/>
+          </w:tcPr>
+          <w:p>
+            <w:pPr>
+              <w:jc w:val="center"/>
+              <w:pBdr>
+                <w:bottom w:val="none" w:sz="0" w:space="0" w:color="000000"/>
+                <w:top w:val="none" w:sz="0" w:space="0" w:color="000000"/>
+                <w:left w:val="none" w:sz="0" w:space="0" w:color="000000"/>
+                <w:right w:val="none" w:sz="0" w:space="0" w:color="000000"/>
+              </w:pBdr>
+              <w:spacing w:after="10" w:before="10" w:line="240"/>
+              <w:ind w:left="100" w:right="100" w:firstLine="0" w:firstLineChars="0"/>
+              <w:rPr>
+                <w:rFonts w:ascii="Arial" w:hAnsi="Arial" w:eastAsia="Arial" w:cs="Arial"/>
+                <w:i w:val="false"/>
+                <w:b w:val="false"/>
+                <w:u w:val="none"/>
+                <w:sz w:val="18"/>
+                <w:szCs w:val="18"/>
+                <w:color w:val="000000"/>
+              </w:rPr>
+            </w:pPr>
+            <w:r>
+              <w:rPr>
+                <w:rFonts w:ascii="Arial" w:hAnsi="Arial" w:eastAsia="Arial" w:cs="Arial"/>
+                <w:i w:val="false"/>
+                <w:b w:val="false"/>
+                <w:u w:val="none"/>
+                <w:sz w:val="18"/>
+                <w:szCs w:val="18"/>
+                <w:color w:val="000000"/>
+              </w:rPr>
+              <w:t xml:space="preserve"/>
+            </w:r>
+          </w:p>
+        </w:tc>
       </w:tr>
       <w:tr>
         <w:trPr>
@@ -3540,10 +4034,62 @@
             </w:r>
           </w:p>
         </w:tc>
+        <w:tc>
+          <w:tcPr>
+            <w:tcBorders>
+              <w:bottom w:val="none" w:sz="0" w:space="0" w:color="000000"/>
+              <w:top w:val="none" w:sz="0" w:space="0" w:color="000000"/>
+              <w:left w:val="none" w:sz="0" w:space="0" w:color="000000"/>
+              <w:right w:val="none" w:sz="0" w:space="0" w:color="000000"/>
+            </w:tcBorders>
+            <w:shd w:val="clear" w:color="auto" w:fill="FFFFFF"/>
+            <w:tcMar>
+              <w:top w:w="0" w:type="dxa"/>
+              <w:bottom w:w="0" w:type="dxa"/>
+              <w:left w:w="0" w:type="dxa"/>
+              <w:right w:w="0" w:type="dxa"/>
+            </w:tcMar>
+            <w:vAlign w:val="top"/>
+          </w:tcPr>
+          <w:p>
+            <w:pPr>
+              <w:jc w:val="center"/>
+              <w:pBdr>
+                <w:bottom w:val="none" w:sz="0" w:space="0" w:color="000000"/>
+                <w:top w:val="none" w:sz="0" w:space="0" w:color="000000"/>
+                <w:left w:val="none" w:sz="0" w:space="0" w:color="000000"/>
+                <w:right w:val="none" w:sz="0" w:space="0" w:color="000000"/>
+              </w:pBdr>
+              <w:spacing w:after="10" w:before="10" w:line="240"/>
+              <w:ind w:left="100" w:right="100" w:firstLine="0" w:firstLineChars="0"/>
+              <w:rPr>
+                <w:rFonts w:ascii="Arial" w:hAnsi="Arial" w:eastAsia="Arial" w:cs="Arial"/>
+                <w:i w:val="false"/>
+                <w:b w:val="false"/>
+                <w:u w:val="none"/>
+                <w:sz w:val="18"/>
+                <w:szCs w:val="18"/>
+                <w:color w:val="000000"/>
+              </w:rPr>
+            </w:pPr>
+            <w:r>
+              <w:rPr>
+                <w:rFonts w:ascii="Arial" w:hAnsi="Arial" w:eastAsia="Arial" w:cs="Arial"/>
+                <w:i w:val="false"/>
+                <w:b w:val="false"/>
+                <w:u w:val="none"/>
+                <w:sz w:val="18"/>
+                <w:szCs w:val="18"/>
+                <w:color w:val="000000"/>
+              </w:rPr>
+              <w:t xml:space="preserve"/>
+            </w:r>
+          </w:p>
+        </w:tc>
       </w:tr>
       <w:tr>
         <w:trPr>
-          <w:trHeight w:val="617" w:hRule="auto"/>
+          <w:trHeight w:val="574" w:hRule="auto"/>
         </w:trPr>
         body 9
         <w:tc>
@@ -3594,7 +4140,7 @@
                 <w:szCs w:val="18"/>
                 <w:color w:val="000000"/>
               </w:rPr>
-              <w:t xml:space="preserve">Level of education, n (%)</w:t>
+              <w:t xml:space="preserve">Level of education</w:t>
             </w:r>
           </w:p>
         </w:tc>
@@ -3907,6 +4453,58 @@
                 <w:color w:val="000000"/>
               </w:rPr>
               <w:t xml:space="preserve">0.129*</w:t>
+            </w:r>
+          </w:p>
+        </w:tc>
+        <w:tc>
+          <w:tcPr>
+            <w:tcBorders>
+              <w:bottom w:val="none" w:sz="0" w:space="0" w:color="000000"/>
+              <w:top w:val="none" w:sz="0" w:space="0" w:color="000000"/>
+              <w:left w:val="none" w:sz="0" w:space="0" w:color="000000"/>
+              <w:right w:val="none" w:sz="0" w:space="0" w:color="000000"/>
+            </w:tcBorders>
+            <w:shd w:val="clear" w:color="auto" w:fill="FFFFFF"/>
+            <w:tcMar>
+              <w:top w:w="0" w:type="dxa"/>
+              <w:bottom w:w="0" w:type="dxa"/>
+              <w:left w:w="0" w:type="dxa"/>
+              <w:right w:w="0" w:type="dxa"/>
+            </w:tcMar>
+            <w:vAlign w:val="top"/>
+          </w:tcPr>
+          <w:p>
+            <w:pPr>
+              <w:jc w:val="center"/>
+              <w:pBdr>
+                <w:bottom w:val="none" w:sz="0" w:space="0" w:color="000000"/>
+                <w:top w:val="none" w:sz="0" w:space="0" w:color="000000"/>
+                <w:left w:val="none" w:sz="0" w:space="0" w:color="000000"/>
+                <w:right w:val="none" w:sz="0" w:space="0" w:color="000000"/>
+              </w:pBdr>
+              <w:spacing w:after="10" w:before="10" w:line="240"/>
+              <w:ind w:left="100" w:right="100" w:firstLine="0" w:firstLineChars="0"/>
+              <w:rPr>
+                <w:rFonts w:ascii="Arial" w:hAnsi="Arial" w:eastAsia="Arial" w:cs="Arial"/>
+                <w:i w:val="false"/>
+                <w:b w:val="false"/>
+                <w:u w:val="none"/>
+                <w:sz w:val="18"/>
+                <w:szCs w:val="18"/>
+                <w:color w:val="000000"/>
+              </w:rPr>
+            </w:pPr>
+            <w:r>
+              <w:rPr>
+                <w:rFonts w:ascii="Arial" w:hAnsi="Arial" w:eastAsia="Arial" w:cs="Arial"/>
+                <w:i w:val="false"/>
+                <w:b w:val="false"/>
+                <w:u w:val="none"/>
+                <w:sz w:val="18"/>
+                <w:szCs w:val="18"/>
+                <w:color w:val="000000"/>
+              </w:rPr>
+              <w:t xml:space="preserve">0.2</w:t>
             </w:r>
           </w:p>
         </w:tc>
@@ -4280,6 +4878,58 @@
             </w:r>
           </w:p>
         </w:tc>
+        <w:tc>
+          <w:tcPr>
+            <w:tcBorders>
+              <w:bottom w:val="none" w:sz="0" w:space="0" w:color="000000"/>
+              <w:top w:val="none" w:sz="0" w:space="0" w:color="000000"/>
+              <w:left w:val="none" w:sz="0" w:space="0" w:color="000000"/>
+              <w:right w:val="none" w:sz="0" w:space="0" w:color="000000"/>
+            </w:tcBorders>
+            <w:shd w:val="clear" w:color="auto" w:fill="FFFFFF"/>
+            <w:tcMar>
+              <w:top w:w="0" w:type="dxa"/>
+              <w:bottom w:w="0" w:type="dxa"/>
+              <w:left w:w="0" w:type="dxa"/>
+              <w:right w:w="0" w:type="dxa"/>
+            </w:tcMar>
+            <w:vAlign w:val="top"/>
+          </w:tcPr>
+          <w:p>
+            <w:pPr>
+              <w:jc w:val="center"/>
+              <w:pBdr>
+                <w:bottom w:val="none" w:sz="0" w:space="0" w:color="000000"/>
+                <w:top w:val="none" w:sz="0" w:space="0" w:color="000000"/>
+                <w:left w:val="none" w:sz="0" w:space="0" w:color="000000"/>
+                <w:right w:val="none" w:sz="0" w:space="0" w:color="000000"/>
+              </w:pBdr>
+              <w:spacing w:after="10" w:before="10" w:line="240"/>
+              <w:ind w:left="100" w:right="100" w:firstLine="0" w:firstLineChars="0"/>
+              <w:rPr>
+                <w:rFonts w:ascii="Arial" w:hAnsi="Arial" w:eastAsia="Arial" w:cs="Arial"/>
+                <w:i w:val="false"/>
+                <w:b w:val="false"/>
+                <w:u w:val="none"/>
+                <w:sz w:val="18"/>
+                <w:szCs w:val="18"/>
+                <w:color w:val="000000"/>
+              </w:rPr>
+            </w:pPr>
+            <w:r>
+              <w:rPr>
+                <w:rFonts w:ascii="Arial" w:hAnsi="Arial" w:eastAsia="Arial" w:cs="Arial"/>
+                <w:i w:val="false"/>
+                <w:b w:val="false"/>
+                <w:u w:val="none"/>
+                <w:sz w:val="18"/>
+                <w:szCs w:val="18"/>
+                <w:color w:val="000000"/>
+              </w:rPr>
+              <w:t xml:space="preserve"/>
+            </w:r>
+          </w:p>
+        </w:tc>
       </w:tr>
       <w:tr>
         <w:trPr>
@@ -4650,6 +5300,58 @@
             </w:r>
           </w:p>
         </w:tc>
+        <w:tc>
+          <w:tcPr>
+            <w:tcBorders>
+              <w:bottom w:val="none" w:sz="0" w:space="0" w:color="000000"/>
+              <w:top w:val="none" w:sz="0" w:space="0" w:color="000000"/>
+              <w:left w:val="none" w:sz="0" w:space="0" w:color="000000"/>
+              <w:right w:val="none" w:sz="0" w:space="0" w:color="000000"/>
+            </w:tcBorders>
+            <w:shd w:val="clear" w:color="auto" w:fill="FFFFFF"/>
+            <w:tcMar>
+              <w:top w:w="0" w:type="dxa"/>
+              <w:bottom w:w="0" w:type="dxa"/>
+              <w:left w:w="0" w:type="dxa"/>
+              <w:right w:w="0" w:type="dxa"/>
+            </w:tcMar>
+            <w:vAlign w:val="top"/>
+          </w:tcPr>
+          <w:p>
+            <w:pPr>
+              <w:jc w:val="center"/>
+              <w:pBdr>
+                <w:bottom w:val="none" w:sz="0" w:space="0" w:color="000000"/>
+                <w:top w:val="none" w:sz="0" w:space="0" w:color="000000"/>
+                <w:left w:val="none" w:sz="0" w:space="0" w:color="000000"/>
+                <w:right w:val="none" w:sz="0" w:space="0" w:color="000000"/>
+              </w:pBdr>
+              <w:spacing w:after="10" w:before="10" w:line="240"/>
+              <w:ind w:left="100" w:right="100" w:firstLine="0" w:firstLineChars="0"/>
+              <w:rPr>
+                <w:rFonts w:ascii="Arial" w:hAnsi="Arial" w:eastAsia="Arial" w:cs="Arial"/>
+                <w:i w:val="false"/>
+                <w:b w:val="false"/>
+                <w:u w:val="none"/>
+                <w:sz w:val="18"/>
+                <w:szCs w:val="18"/>
+                <w:color w:val="000000"/>
+              </w:rPr>
+            </w:pPr>
+            <w:r>
+              <w:rPr>
+                <w:rFonts w:ascii="Arial" w:hAnsi="Arial" w:eastAsia="Arial" w:cs="Arial"/>
+                <w:i w:val="false"/>
+                <w:b w:val="false"/>
+                <w:u w:val="none"/>
+                <w:sz w:val="18"/>
+                <w:szCs w:val="18"/>
+                <w:color w:val="000000"/>
+              </w:rPr>
+              <w:t xml:space="preserve"/>
+            </w:r>
+          </w:p>
+        </w:tc>
       </w:tr>
       <w:tr>
         <w:trPr>
@@ -5020,10 +5722,62 @@
             </w:r>
           </w:p>
         </w:tc>
+        <w:tc>
+          <w:tcPr>
+            <w:tcBorders>
+              <w:bottom w:val="none" w:sz="0" w:space="0" w:color="000000"/>
+              <w:top w:val="none" w:sz="0" w:space="0" w:color="000000"/>
+              <w:left w:val="none" w:sz="0" w:space="0" w:color="000000"/>
+              <w:right w:val="none" w:sz="0" w:space="0" w:color="000000"/>
+            </w:tcBorders>
+            <w:shd w:val="clear" w:color="auto" w:fill="FFFFFF"/>
+            <w:tcMar>
+              <w:top w:w="0" w:type="dxa"/>
+              <w:bottom w:w="0" w:type="dxa"/>
+              <w:left w:w="0" w:type="dxa"/>
+              <w:right w:w="0" w:type="dxa"/>
+            </w:tcMar>
+            <w:vAlign w:val="top"/>
+          </w:tcPr>
+          <w:p>
+            <w:pPr>
+              <w:jc w:val="center"/>
+              <w:pBdr>
+                <w:bottom w:val="none" w:sz="0" w:space="0" w:color="000000"/>
+                <w:top w:val="none" w:sz="0" w:space="0" w:color="000000"/>
+                <w:left w:val="none" w:sz="0" w:space="0" w:color="000000"/>
+                <w:right w:val="none" w:sz="0" w:space="0" w:color="000000"/>
+              </w:pBdr>
+              <w:spacing w:after="10" w:before="10" w:line="240"/>
+              <w:ind w:left="100" w:right="100" w:firstLine="0" w:firstLineChars="0"/>
+              <w:rPr>
+                <w:rFonts w:ascii="Arial" w:hAnsi="Arial" w:eastAsia="Arial" w:cs="Arial"/>
+                <w:i w:val="false"/>
+                <w:b w:val="false"/>
+                <w:u w:val="none"/>
+                <w:sz w:val="18"/>
+                <w:szCs w:val="18"/>
+                <w:color w:val="000000"/>
+              </w:rPr>
+            </w:pPr>
+            <w:r>
+              <w:rPr>
+                <w:rFonts w:ascii="Arial" w:hAnsi="Arial" w:eastAsia="Arial" w:cs="Arial"/>
+                <w:i w:val="false"/>
+                <w:b w:val="false"/>
+                <w:u w:val="none"/>
+                <w:sz w:val="18"/>
+                <w:szCs w:val="18"/>
+                <w:color w:val="000000"/>
+              </w:rPr>
+              <w:t xml:space="preserve"/>
+            </w:r>
+          </w:p>
+        </w:tc>
       </w:tr>
       <w:tr>
         <w:trPr>
-          <w:trHeight w:val="617" w:hRule="auto"/>
+          <w:trHeight w:val="612" w:hRule="auto"/>
         </w:trPr>
         body13
         <w:tc>
@@ -5074,7 +5828,7 @@
                 <w:szCs w:val="18"/>
                 <w:color w:val="000000"/>
               </w:rPr>
-              <w:t xml:space="preserve">Department, n (%)</w:t>
+              <w:t xml:space="preserve">Department</w:t>
             </w:r>
           </w:p>
         </w:tc>
@@ -5387,6 +6141,58 @@
                 <w:color w:val="000000"/>
               </w:rPr>
               <w:t xml:space="preserve">&lt;0.001**</w:t>
+            </w:r>
+          </w:p>
+        </w:tc>
+        <w:tc>
+          <w:tcPr>
+            <w:tcBorders>
+              <w:bottom w:val="none" w:sz="0" w:space="0" w:color="000000"/>
+              <w:top w:val="none" w:sz="0" w:space="0" w:color="000000"/>
+              <w:left w:val="none" w:sz="0" w:space="0" w:color="000000"/>
+              <w:right w:val="none" w:sz="0" w:space="0" w:color="000000"/>
+            </w:tcBorders>
+            <w:shd w:val="clear" w:color="auto" w:fill="FFFFFF"/>
+            <w:tcMar>
+              <w:top w:w="0" w:type="dxa"/>
+              <w:bottom w:w="0" w:type="dxa"/>
+              <w:left w:w="0" w:type="dxa"/>
+              <w:right w:w="0" w:type="dxa"/>
+            </w:tcMar>
+            <w:vAlign w:val="top"/>
+          </w:tcPr>
+          <w:p>
+            <w:pPr>
+              <w:jc w:val="center"/>
+              <w:pBdr>
+                <w:bottom w:val="none" w:sz="0" w:space="0" w:color="000000"/>
+                <w:top w:val="none" w:sz="0" w:space="0" w:color="000000"/>
+                <w:left w:val="none" w:sz="0" w:space="0" w:color="000000"/>
+                <w:right w:val="none" w:sz="0" w:space="0" w:color="000000"/>
+              </w:pBdr>
+              <w:spacing w:after="10" w:before="10" w:line="240"/>
+              <w:ind w:left="100" w:right="100" w:firstLine="0" w:firstLineChars="0"/>
+              <w:rPr>
+                <w:rFonts w:ascii="Arial" w:hAnsi="Arial" w:eastAsia="Arial" w:cs="Arial"/>
+                <w:i w:val="false"/>
+                <w:b w:val="false"/>
+                <w:u w:val="none"/>
+                <w:sz w:val="18"/>
+                <w:szCs w:val="18"/>
+                <w:color w:val="000000"/>
+              </w:rPr>
+            </w:pPr>
+            <w:r>
+              <w:rPr>
+                <w:rFonts w:ascii="Arial" w:hAnsi="Arial" w:eastAsia="Arial" w:cs="Arial"/>
+                <w:i w:val="false"/>
+                <w:b w:val="false"/>
+                <w:u w:val="none"/>
+                <w:sz w:val="18"/>
+                <w:szCs w:val="18"/>
+                <w:color w:val="000000"/>
+              </w:rPr>
+              <w:t xml:space="preserve">&lt;0.001</w:t>
             </w:r>
           </w:p>
         </w:tc>
@@ -5760,6 +6566,58 @@
             </w:r>
           </w:p>
         </w:tc>
+        <w:tc>
+          <w:tcPr>
+            <w:tcBorders>
+              <w:bottom w:val="none" w:sz="0" w:space="0" w:color="000000"/>
+              <w:top w:val="none" w:sz="0" w:space="0" w:color="000000"/>
+              <w:left w:val="none" w:sz="0" w:space="0" w:color="000000"/>
+              <w:right w:val="none" w:sz="0" w:space="0" w:color="000000"/>
+            </w:tcBorders>
+            <w:shd w:val="clear" w:color="auto" w:fill="FFFFFF"/>
+            <w:tcMar>
+              <w:top w:w="0" w:type="dxa"/>
+              <w:bottom w:w="0" w:type="dxa"/>
+              <w:left w:w="0" w:type="dxa"/>
+              <w:right w:w="0" w:type="dxa"/>
+            </w:tcMar>
+            <w:vAlign w:val="top"/>
+          </w:tcPr>
+          <w:p>
+            <w:pPr>
+              <w:jc w:val="center"/>
+              <w:pBdr>
+                <w:bottom w:val="none" w:sz="0" w:space="0" w:color="000000"/>
+                <w:top w:val="none" w:sz="0" w:space="0" w:color="000000"/>
+                <w:left w:val="none" w:sz="0" w:space="0" w:color="000000"/>
+                <w:right w:val="none" w:sz="0" w:space="0" w:color="000000"/>
+              </w:pBdr>
+              <w:spacing w:after="10" w:before="10" w:line="240"/>
+              <w:ind w:left="100" w:right="100" w:firstLine="0" w:firstLineChars="0"/>
+              <w:rPr>
+                <w:rFonts w:ascii="Arial" w:hAnsi="Arial" w:eastAsia="Arial" w:cs="Arial"/>
+                <w:i w:val="false"/>
+                <w:b w:val="false"/>
+                <w:u w:val="none"/>
+                <w:sz w:val="18"/>
+                <w:szCs w:val="18"/>
+                <w:color w:val="000000"/>
+              </w:rPr>
+            </w:pPr>
+            <w:r>
+              <w:rPr>
+                <w:rFonts w:ascii="Arial" w:hAnsi="Arial" w:eastAsia="Arial" w:cs="Arial"/>
+                <w:i w:val="false"/>
+                <w:b w:val="false"/>
+                <w:u w:val="none"/>
+                <w:sz w:val="18"/>
+                <w:szCs w:val="18"/>
+                <w:color w:val="000000"/>
+              </w:rPr>
+              <w:t xml:space="preserve"/>
+            </w:r>
+          </w:p>
+        </w:tc>
       </w:tr>
       <w:tr>
         <w:trPr>
@@ -6130,6 +6988,58 @@
             </w:r>
           </w:p>
         </w:tc>
+        <w:tc>
+          <w:tcPr>
+            <w:tcBorders>
+              <w:bottom w:val="none" w:sz="0" w:space="0" w:color="000000"/>
+              <w:top w:val="none" w:sz="0" w:space="0" w:color="000000"/>
+              <w:left w:val="none" w:sz="0" w:space="0" w:color="000000"/>
+              <w:right w:val="none" w:sz="0" w:space="0" w:color="000000"/>
+            </w:tcBorders>
+            <w:shd w:val="clear" w:color="auto" w:fill="FFFFFF"/>
+            <w:tcMar>
+              <w:top w:w="0" w:type="dxa"/>
+              <w:bottom w:w="0" w:type="dxa"/>
+              <w:left w:w="0" w:type="dxa"/>
+              <w:right w:w="0" w:type="dxa"/>
+            </w:tcMar>
+            <w:vAlign w:val="top"/>
+          </w:tcPr>
+          <w:p>
+            <w:pPr>
+              <w:jc w:val="center"/>
+              <w:pBdr>
+                <w:bottom w:val="none" w:sz="0" w:space="0" w:color="000000"/>
+                <w:top w:val="none" w:sz="0" w:space="0" w:color="000000"/>
+                <w:left w:val="none" w:sz="0" w:space="0" w:color="000000"/>
+                <w:right w:val="none" w:sz="0" w:space="0" w:color="000000"/>
+              </w:pBdr>
+              <w:spacing w:after="10" w:before="10" w:line="240"/>
+              <w:ind w:left="100" w:right="100" w:firstLine="0" w:firstLineChars="0"/>
+              <w:rPr>
+                <w:rFonts w:ascii="Arial" w:hAnsi="Arial" w:eastAsia="Arial" w:cs="Arial"/>
+                <w:i w:val="false"/>
+                <w:b w:val="false"/>
+                <w:u w:val="none"/>
+                <w:sz w:val="18"/>
+                <w:szCs w:val="18"/>
+                <w:color w:val="000000"/>
+              </w:rPr>
+            </w:pPr>
+            <w:r>
+              <w:rPr>
+                <w:rFonts w:ascii="Arial" w:hAnsi="Arial" w:eastAsia="Arial" w:cs="Arial"/>
+                <w:i w:val="false"/>
+                <w:b w:val="false"/>
+                <w:u w:val="none"/>
+                <w:sz w:val="18"/>
+                <w:szCs w:val="18"/>
+                <w:color w:val="000000"/>
+              </w:rPr>
+              <w:t xml:space="preserve"/>
+            </w:r>
+          </w:p>
+        </w:tc>
       </w:tr>
       <w:tr>
         <w:trPr>
@@ -6500,6 +7410,58 @@
             </w:r>
           </w:p>
         </w:tc>
+        <w:tc>
+          <w:tcPr>
+            <w:tcBorders>
+              <w:bottom w:val="none" w:sz="0" w:space="0" w:color="000000"/>
+              <w:top w:val="none" w:sz="0" w:space="0" w:color="000000"/>
+              <w:left w:val="none" w:sz="0" w:space="0" w:color="000000"/>
+              <w:right w:val="none" w:sz="0" w:space="0" w:color="000000"/>
+            </w:tcBorders>
+            <w:shd w:val="clear" w:color="auto" w:fill="FFFFFF"/>
+            <w:tcMar>
+              <w:top w:w="0" w:type="dxa"/>
+              <w:bottom w:w="0" w:type="dxa"/>
+              <w:left w:w="0" w:type="dxa"/>
+              <w:right w:w="0" w:type="dxa"/>
+            </w:tcMar>
+            <w:vAlign w:val="top"/>
+          </w:tcPr>
+          <w:p>
+            <w:pPr>
+              <w:jc w:val="center"/>
+              <w:pBdr>
+                <w:bottom w:val="none" w:sz="0" w:space="0" w:color="000000"/>
+                <w:top w:val="none" w:sz="0" w:space="0" w:color="000000"/>
+                <w:left w:val="none" w:sz="0" w:space="0" w:color="000000"/>
+                <w:right w:val="none" w:sz="0" w:space="0" w:color="000000"/>
+              </w:pBdr>
+              <w:spacing w:after="10" w:before="10" w:line="240"/>
+              <w:ind w:left="100" w:right="100" w:firstLine="0" w:firstLineChars="0"/>
+              <w:rPr>
+                <w:rFonts w:ascii="Arial" w:hAnsi="Arial" w:eastAsia="Arial" w:cs="Arial"/>
+                <w:i w:val="false"/>
+                <w:b w:val="false"/>
+                <w:u w:val="none"/>
+                <w:sz w:val="18"/>
+                <w:szCs w:val="18"/>
+                <w:color w:val="000000"/>
+              </w:rPr>
+            </w:pPr>
+            <w:r>
+              <w:rPr>
+                <w:rFonts w:ascii="Arial" w:hAnsi="Arial" w:eastAsia="Arial" w:cs="Arial"/>
+                <w:i w:val="false"/>
+                <w:b w:val="false"/>
+                <w:u w:val="none"/>
+                <w:sz w:val="18"/>
+                <w:szCs w:val="18"/>
+                <w:color w:val="000000"/>
+              </w:rPr>
+              <w:t xml:space="preserve"/>
+            </w:r>
+          </w:p>
+        </w:tc>
       </w:tr>
       <w:tr>
         <w:trPr>
@@ -6870,10 +7832,62 @@
             </w:r>
           </w:p>
         </w:tc>
+        <w:tc>
+          <w:tcPr>
+            <w:tcBorders>
+              <w:bottom w:val="none" w:sz="0" w:space="0" w:color="000000"/>
+              <w:top w:val="none" w:sz="0" w:space="0" w:color="000000"/>
+              <w:left w:val="none" w:sz="0" w:space="0" w:color="000000"/>
+              <w:right w:val="none" w:sz="0" w:space="0" w:color="000000"/>
+            </w:tcBorders>
+            <w:shd w:val="clear" w:color="auto" w:fill="FFFFFF"/>
+            <w:tcMar>
+              <w:top w:w="0" w:type="dxa"/>
+              <w:bottom w:w="0" w:type="dxa"/>
+              <w:left w:w="0" w:type="dxa"/>
+              <w:right w:w="0" w:type="dxa"/>
+            </w:tcMar>
+            <w:vAlign w:val="top"/>
+          </w:tcPr>
+          <w:p>
+            <w:pPr>
+              <w:jc w:val="center"/>
+              <w:pBdr>
+                <w:bottom w:val="none" w:sz="0" w:space="0" w:color="000000"/>
+                <w:top w:val="none" w:sz="0" w:space="0" w:color="000000"/>
+                <w:left w:val="none" w:sz="0" w:space="0" w:color="000000"/>
+                <w:right w:val="none" w:sz="0" w:space="0" w:color="000000"/>
+              </w:pBdr>
+              <w:spacing w:after="10" w:before="10" w:line="240"/>
+              <w:ind w:left="100" w:right="100" w:firstLine="0" w:firstLineChars="0"/>
+              <w:rPr>
+                <w:rFonts w:ascii="Arial" w:hAnsi="Arial" w:eastAsia="Arial" w:cs="Arial"/>
+                <w:i w:val="false"/>
+                <w:b w:val="false"/>
+                <w:u w:val="none"/>
+                <w:sz w:val="18"/>
+                <w:szCs w:val="18"/>
+                <w:color w:val="000000"/>
+              </w:rPr>
+            </w:pPr>
+            <w:r>
+              <w:rPr>
+                <w:rFonts w:ascii="Arial" w:hAnsi="Arial" w:eastAsia="Arial" w:cs="Arial"/>
+                <w:i w:val="false"/>
+                <w:b w:val="false"/>
+                <w:u w:val="none"/>
+                <w:sz w:val="18"/>
+                <w:szCs w:val="18"/>
+                <w:color w:val="000000"/>
+              </w:rPr>
+              <w:t xml:space="preserve"/>
+            </w:r>
+          </w:p>
+        </w:tc>
       </w:tr>
       <w:tr>
         <w:trPr>
-          <w:trHeight w:val="617" w:hRule="auto"/>
+          <w:trHeight w:val="614" w:hRule="auto"/>
         </w:trPr>
         body18
         <w:tc>
@@ -6924,7 +7938,7 @@
                 <w:szCs w:val="18"/>
                 <w:color w:val="000000"/>
               </w:rPr>
-              <w:t xml:space="preserve">Ethnic group, n (%)</w:t>
+              <w:t xml:space="preserve">Ethnic group</w:t>
             </w:r>
           </w:p>
         </w:tc>
@@ -7237,6 +8251,58 @@
                 <w:color w:val="000000"/>
               </w:rPr>
               <w:t xml:space="preserve">0.333**</w:t>
+            </w:r>
+          </w:p>
+        </w:tc>
+        <w:tc>
+          <w:tcPr>
+            <w:tcBorders>
+              <w:bottom w:val="none" w:sz="0" w:space="0" w:color="000000"/>
+              <w:top w:val="none" w:sz="0" w:space="0" w:color="000000"/>
+              <w:left w:val="none" w:sz="0" w:space="0" w:color="000000"/>
+              <w:right w:val="none" w:sz="0" w:space="0" w:color="000000"/>
+            </w:tcBorders>
+            <w:shd w:val="clear" w:color="auto" w:fill="FFFFFF"/>
+            <w:tcMar>
+              <w:top w:w="0" w:type="dxa"/>
+              <w:bottom w:w="0" w:type="dxa"/>
+              <w:left w:w="0" w:type="dxa"/>
+              <w:right w:w="0" w:type="dxa"/>
+            </w:tcMar>
+            <w:vAlign w:val="top"/>
+          </w:tcPr>
+          <w:p>
+            <w:pPr>
+              <w:jc w:val="center"/>
+              <w:pBdr>
+                <w:bottom w:val="none" w:sz="0" w:space="0" w:color="000000"/>
+                <w:top w:val="none" w:sz="0" w:space="0" w:color="000000"/>
+                <w:left w:val="none" w:sz="0" w:space="0" w:color="000000"/>
+                <w:right w:val="none" w:sz="0" w:space="0" w:color="000000"/>
+              </w:pBdr>
+              <w:spacing w:after="10" w:before="10" w:line="240"/>
+              <w:ind w:left="100" w:right="100" w:firstLine="0" w:firstLineChars="0"/>
+              <w:rPr>
+                <w:rFonts w:ascii="Arial" w:hAnsi="Arial" w:eastAsia="Arial" w:cs="Arial"/>
+                <w:i w:val="false"/>
+                <w:b w:val="false"/>
+                <w:u w:val="none"/>
+                <w:sz w:val="18"/>
+                <w:szCs w:val="18"/>
+                <w:color w:val="000000"/>
+              </w:rPr>
+            </w:pPr>
+            <w:r>
+              <w:rPr>
+                <w:rFonts w:ascii="Arial" w:hAnsi="Arial" w:eastAsia="Arial" w:cs="Arial"/>
+                <w:i w:val="false"/>
+                <w:b w:val="false"/>
+                <w:u w:val="none"/>
+                <w:sz w:val="18"/>
+                <w:szCs w:val="18"/>
+                <w:color w:val="000000"/>
+              </w:rPr>
+              <w:t xml:space="preserve">0.4</w:t>
             </w:r>
           </w:p>
         </w:tc>
@@ -7610,6 +8676,58 @@
             </w:r>
           </w:p>
         </w:tc>
+        <w:tc>
+          <w:tcPr>
+            <w:tcBorders>
+              <w:bottom w:val="none" w:sz="0" w:space="0" w:color="000000"/>
+              <w:top w:val="none" w:sz="0" w:space="0" w:color="000000"/>
+              <w:left w:val="none" w:sz="0" w:space="0" w:color="000000"/>
+              <w:right w:val="none" w:sz="0" w:space="0" w:color="000000"/>
+            </w:tcBorders>
+            <w:shd w:val="clear" w:color="auto" w:fill="FFFFFF"/>
+            <w:tcMar>
+              <w:top w:w="0" w:type="dxa"/>
+              <w:bottom w:w="0" w:type="dxa"/>
+              <w:left w:w="0" w:type="dxa"/>
+              <w:right w:w="0" w:type="dxa"/>
+            </w:tcMar>
+            <w:vAlign w:val="top"/>
+          </w:tcPr>
+          <w:p>
+            <w:pPr>
+              <w:jc w:val="center"/>
+              <w:pBdr>
+                <w:bottom w:val="none" w:sz="0" w:space="0" w:color="000000"/>
+                <w:top w:val="none" w:sz="0" w:space="0" w:color="000000"/>
+                <w:left w:val="none" w:sz="0" w:space="0" w:color="000000"/>
+                <w:right w:val="none" w:sz="0" w:space="0" w:color="000000"/>
+              </w:pBdr>
+              <w:spacing w:after="10" w:before="10" w:line="240"/>
+              <w:ind w:left="100" w:right="100" w:firstLine="0" w:firstLineChars="0"/>
+              <w:rPr>
+                <w:rFonts w:ascii="Arial" w:hAnsi="Arial" w:eastAsia="Arial" w:cs="Arial"/>
+                <w:i w:val="false"/>
+                <w:b w:val="false"/>
+                <w:u w:val="none"/>
+                <w:sz w:val="18"/>
+                <w:szCs w:val="18"/>
+                <w:color w:val="000000"/>
+              </w:rPr>
+            </w:pPr>
+            <w:r>
+              <w:rPr>
+                <w:rFonts w:ascii="Arial" w:hAnsi="Arial" w:eastAsia="Arial" w:cs="Arial"/>
+                <w:i w:val="false"/>
+                <w:b w:val="false"/>
+                <w:u w:val="none"/>
+                <w:sz w:val="18"/>
+                <w:szCs w:val="18"/>
+                <w:color w:val="000000"/>
+              </w:rPr>
+              <w:t xml:space="preserve"/>
+            </w:r>
+          </w:p>
+        </w:tc>
       </w:tr>
       <w:tr>
         <w:trPr>
@@ -7980,6 +9098,58 @@
             </w:r>
           </w:p>
         </w:tc>
+        <w:tc>
+          <w:tcPr>
+            <w:tcBorders>
+              <w:bottom w:val="none" w:sz="0" w:space="0" w:color="000000"/>
+              <w:top w:val="none" w:sz="0" w:space="0" w:color="000000"/>
+              <w:left w:val="none" w:sz="0" w:space="0" w:color="000000"/>
+              <w:right w:val="none" w:sz="0" w:space="0" w:color="000000"/>
+            </w:tcBorders>
+            <w:shd w:val="clear" w:color="auto" w:fill="FFFFFF"/>
+            <w:tcMar>
+              <w:top w:w="0" w:type="dxa"/>
+              <w:bottom w:w="0" w:type="dxa"/>
+              <w:left w:w="0" w:type="dxa"/>
+              <w:right w:w="0" w:type="dxa"/>
+            </w:tcMar>
+            <w:vAlign w:val="top"/>
+          </w:tcPr>
+          <w:p>
+            <w:pPr>
+              <w:jc w:val="center"/>
+              <w:pBdr>
+                <w:bottom w:val="none" w:sz="0" w:space="0" w:color="000000"/>
+                <w:top w:val="none" w:sz="0" w:space="0" w:color="000000"/>
+                <w:left w:val="none" w:sz="0" w:space="0" w:color="000000"/>
+                <w:right w:val="none" w:sz="0" w:space="0" w:color="000000"/>
+              </w:pBdr>
+              <w:spacing w:after="10" w:before="10" w:line="240"/>
+              <w:ind w:left="100" w:right="100" w:firstLine="0" w:firstLineChars="0"/>
+              <w:rPr>
+                <w:rFonts w:ascii="Arial" w:hAnsi="Arial" w:eastAsia="Arial" w:cs="Arial"/>
+                <w:i w:val="false"/>
+                <w:b w:val="false"/>
+                <w:u w:val="none"/>
+                <w:sz w:val="18"/>
+                <w:szCs w:val="18"/>
+                <w:color w:val="000000"/>
+              </w:rPr>
+            </w:pPr>
+            <w:r>
+              <w:rPr>
+                <w:rFonts w:ascii="Arial" w:hAnsi="Arial" w:eastAsia="Arial" w:cs="Arial"/>
+                <w:i w:val="false"/>
+                <w:b w:val="false"/>
+                <w:u w:val="none"/>
+                <w:sz w:val="18"/>
+                <w:szCs w:val="18"/>
+                <w:color w:val="000000"/>
+              </w:rPr>
+              <w:t xml:space="preserve"/>
+            </w:r>
+          </w:p>
+        </w:tc>
       </w:tr>
       <w:tr>
         <w:trPr>
@@ -8034,7 +9204,7 @@
                 <w:szCs w:val="18"/>
                 <w:color w:val="000000"/>
               </w:rPr>
-              <w:t xml:space="preserve">Alpha-1-acid glycoprotein (g/L), Median (Q1, Q3)</w:t>
+              <w:t xml:space="preserve">Alpha-1-acid glycoprotein (g/L)</w:t>
             </w:r>
           </w:p>
         </w:tc>
@@ -8347,6 +9517,58 @@
                 <w:color w:val="000000"/>
               </w:rPr>
               <w:t xml:space="preserve">0.001*</w:t>
+            </w:r>
+          </w:p>
+        </w:tc>
+        <w:tc>
+          <w:tcPr>
+            <w:tcBorders>
+              <w:bottom w:val="none" w:sz="0" w:space="0" w:color="000000"/>
+              <w:top w:val="none" w:sz="0" w:space="0" w:color="000000"/>
+              <w:left w:val="none" w:sz="0" w:space="0" w:color="000000"/>
+              <w:right w:val="none" w:sz="0" w:space="0" w:color="000000"/>
+            </w:tcBorders>
+            <w:shd w:val="clear" w:color="auto" w:fill="FFFFFF"/>
+            <w:tcMar>
+              <w:top w:w="0" w:type="dxa"/>
+              <w:bottom w:w="0" w:type="dxa"/>
+              <w:left w:w="0" w:type="dxa"/>
+              <w:right w:w="0" w:type="dxa"/>
+            </w:tcMar>
+            <w:vAlign w:val="top"/>
+          </w:tcPr>
+          <w:p>
+            <w:pPr>
+              <w:jc w:val="center"/>
+              <w:pBdr>
+                <w:bottom w:val="none" w:sz="0" w:space="0" w:color="000000"/>
+                <w:top w:val="none" w:sz="0" w:space="0" w:color="000000"/>
+                <w:left w:val="none" w:sz="0" w:space="0" w:color="000000"/>
+                <w:right w:val="none" w:sz="0" w:space="0" w:color="000000"/>
+              </w:pBdr>
+              <w:spacing w:after="10" w:before="10" w:line="240"/>
+              <w:ind w:left="100" w:right="100" w:firstLine="0" w:firstLineChars="0"/>
+              <w:rPr>
+                <w:rFonts w:ascii="Arial" w:hAnsi="Arial" w:eastAsia="Arial" w:cs="Arial"/>
+                <w:i w:val="false"/>
+                <w:b w:val="false"/>
+                <w:u w:val="none"/>
+                <w:sz w:val="18"/>
+                <w:szCs w:val="18"/>
+                <w:color w:val="000000"/>
+              </w:rPr>
+            </w:pPr>
+            <w:r>
+              <w:rPr>
+                <w:rFonts w:ascii="Arial" w:hAnsi="Arial" w:eastAsia="Arial" w:cs="Arial"/>
+                <w:i w:val="false"/>
+                <w:b w:val="false"/>
+                <w:u w:val="none"/>
+                <w:sz w:val="18"/>
+                <w:szCs w:val="18"/>
+                <w:color w:val="000000"/>
+              </w:rPr>
+              <w:t xml:space="preserve">0.004</w:t>
             </w:r>
           </w:p>
         </w:tc>
@@ -8404,7 +9626,7 @@
                 <w:szCs w:val="18"/>
                 <w:color w:val="000000"/>
               </w:rPr>
-              <w:t xml:space="preserve">C-reactive protein (g/L) (mg/L), Median (Q1, Q3)</w:t>
+              <w:t xml:space="preserve">C-reactive protein (g/L) (mg/L)</w:t>
             </w:r>
           </w:p>
         </w:tc>
@@ -8717,6 +9939,58 @@
                 <w:color w:val="000000"/>
               </w:rPr>
               <w:t xml:space="preserve">0.032*</w:t>
+            </w:r>
+          </w:p>
+        </w:tc>
+        <w:tc>
+          <w:tcPr>
+            <w:tcBorders>
+              <w:bottom w:val="single" w:sz="12" w:space="0" w:color="666666"/>
+              <w:top w:val="none" w:sz="0" w:space="0" w:color="000000"/>
+              <w:left w:val="none" w:sz="0" w:space="0" w:color="000000"/>
+              <w:right w:val="none" w:sz="0" w:space="0" w:color="000000"/>
+            </w:tcBorders>
+            <w:shd w:val="clear" w:color="auto" w:fill="FFFFFF"/>
+            <w:tcMar>
+              <w:top w:w="0" w:type="dxa"/>
+              <w:bottom w:w="0" w:type="dxa"/>
+              <w:left w:w="0" w:type="dxa"/>
+              <w:right w:w="0" w:type="dxa"/>
+            </w:tcMar>
+            <w:vAlign w:val="top"/>
+          </w:tcPr>
+          <w:p>
+            <w:pPr>
+              <w:jc w:val="center"/>
+              <w:pBdr>
+                <w:bottom w:val="none" w:sz="0" w:space="0" w:color="000000"/>
+                <w:top w:val="none" w:sz="0" w:space="0" w:color="000000"/>
+                <w:left w:val="none" w:sz="0" w:space="0" w:color="000000"/>
+                <w:right w:val="none" w:sz="0" w:space="0" w:color="000000"/>
+              </w:pBdr>
+              <w:spacing w:after="10" w:before="10" w:line="240"/>
+              <w:ind w:left="100" w:right="100" w:firstLine="0" w:firstLineChars="0"/>
+              <w:rPr>
+                <w:rFonts w:ascii="Arial" w:hAnsi="Arial" w:eastAsia="Arial" w:cs="Arial"/>
+                <w:i w:val="false"/>
+                <w:b w:val="false"/>
+                <w:u w:val="none"/>
+                <w:sz w:val="18"/>
+                <w:szCs w:val="18"/>
+                <w:color w:val="000000"/>
+              </w:rPr>
+            </w:pPr>
+            <w:r>
+              <w:rPr>
+                <w:rFonts w:ascii="Arial" w:hAnsi="Arial" w:eastAsia="Arial" w:cs="Arial"/>
+                <w:i w:val="false"/>
+                <w:b w:val="false"/>
+                <w:u w:val="none"/>
+                <w:sz w:val="18"/>
+                <w:szCs w:val="18"/>
+                <w:color w:val="000000"/>
+              </w:rPr>
+              <w:t xml:space="preserve">0.052</w:t>
             </w:r>
           </w:p>
         </w:tc>
@@ -8728,10 +10002,154 @@
         footer 1
         <w:tc>
           <w:tcPr>
-            <w:gridSpan w:val="7"/>
+            <w:gridSpan w:val="8"/>
+            <w:tcBorders>
+              <w:bottom w:val="none" w:sz="0" w:space="0" w:color="000000"/>
+              <w:top w:val="single" w:sz="12" w:space="0" w:color="666666"/>
+              <w:left w:val="none" w:sz="0" w:space="0" w:color="000000"/>
+              <w:right w:val="none" w:sz="0" w:space="0" w:color="000000"/>
+            </w:tcBorders>
+            <w:shd w:val="clear" w:color="auto" w:fill="FFFFFF"/>
+            <w:tcMar>
+              <w:top w:w="0" w:type="dxa"/>
+              <w:bottom w:w="0" w:type="dxa"/>
+              <w:left w:w="0" w:type="dxa"/>
+              <w:right w:w="0" w:type="dxa"/>
+            </w:tcMar>
+            <w:vAlign w:val="center"/>
+          </w:tcPr>
+          <w:p>
+            <w:pPr>
+              <w:jc w:val="left"/>
+              <w:pBdr>
+                <w:bottom w:val="none" w:sz="0" w:space="0" w:color="000000"/>
+                <w:top w:val="none" w:sz="0" w:space="0" w:color="000000"/>
+                <w:left w:val="none" w:sz="0" w:space="0" w:color="000000"/>
+                <w:right w:val="none" w:sz="0" w:space="0" w:color="000000"/>
+              </w:pBdr>
+              <w:spacing w:after="10" w:before="10" w:line="240"/>
+              <w:ind w:left="100" w:right="100" w:firstLine="0" w:firstLineChars="0"/>
+              <w:rPr>
+                <w:rFonts w:ascii="Arial" w:hAnsi="Arial" w:eastAsia="Arial" w:cs="Arial"/>
+                <w:i w:val="false"/>
+                <w:b w:val="false"/>
+                <w:u w:val="none"/>
+                <w:sz w:val="18"/>
+                <w:szCs w:val="18"/>
+                <w:color w:val="000000"/>
+              </w:rPr>
+            </w:pPr>
+            <w:r>
+              <w:rPr>
+                <w:rFonts w:ascii="Arial" w:hAnsi="Arial" w:eastAsia="Arial" w:cs="Arial"/>
+                <w:i w:val="false"/>
+                <w:b w:val="false"/>
+                <w:u w:val="none"/>
+                <w:vertAlign w:val="superscript"/>
+                <w:sz w:val="18"/>
+                <w:szCs w:val="18"/>
+                <w:color w:val="000000"/>
+              </w:rPr>
+              <w:t xml:space="preserve">1</w:t>
+            </w:r>
+            <w:r>
+              <w:rPr>
+                <w:rFonts w:ascii="Arial" w:hAnsi="Arial" w:eastAsia="Arial" w:cs="Arial"/>
+                <w:i w:val="false"/>
+                <w:b w:val="false"/>
+                <w:u w:val="none"/>
+                <w:sz w:val="18"/>
+                <w:szCs w:val="18"/>
+                <w:color w:val="000000"/>
+              </w:rPr>
+              <w:t xml:space="preserve">Median (Q1, Q3); n (%)</w:t>
+            </w:r>
+          </w:p>
+        </w:tc>
+      </w:tr>
+      <w:tr>
+        <w:trPr>
+          <w:trHeight w:val="360" w:hRule="auto"/>
+        </w:trPr>
+        footer 2
+        <w:tc>
+          <w:tcPr>
+            <w:gridSpan w:val="8"/>
+            <w:tcBorders>
+              <w:bottom w:val="none" w:sz="0" w:space="0" w:color="000000"/>
+              <w:top w:val="none" w:sz="0" w:space="0" w:color="000000"/>
+              <w:left w:val="none" w:sz="0" w:space="0" w:color="000000"/>
+              <w:right w:val="none" w:sz="0" w:space="0" w:color="000000"/>
+            </w:tcBorders>
+            <w:shd w:val="clear" w:color="auto" w:fill="FFFFFF"/>
+            <w:tcMar>
+              <w:top w:w="0" w:type="dxa"/>
+              <w:bottom w:w="0" w:type="dxa"/>
+              <w:left w:w="0" w:type="dxa"/>
+              <w:right w:w="0" w:type="dxa"/>
+            </w:tcMar>
+            <w:vAlign w:val="center"/>
+          </w:tcPr>
+          <w:p>
+            <w:pPr>
+              <w:jc w:val="left"/>
+              <w:pBdr>
+                <w:bottom w:val="none" w:sz="0" w:space="0" w:color="000000"/>
+                <w:top w:val="none" w:sz="0" w:space="0" w:color="000000"/>
+                <w:left w:val="none" w:sz="0" w:space="0" w:color="000000"/>
+                <w:right w:val="none" w:sz="0" w:space="0" w:color="000000"/>
+              </w:pBdr>
+              <w:spacing w:after="10" w:before="10" w:line="240"/>
+              <w:ind w:left="100" w:right="100" w:firstLine="0" w:firstLineChars="0"/>
+              <w:rPr>
+                <w:rFonts w:ascii="Arial" w:hAnsi="Arial" w:eastAsia="Arial" w:cs="Arial"/>
+                <w:i w:val="false"/>
+                <w:b w:val="false"/>
+                <w:u w:val="none"/>
+                <w:sz w:val="18"/>
+                <w:szCs w:val="18"/>
+                <w:color w:val="000000"/>
+              </w:rPr>
+            </w:pPr>
+            <w:r>
+              <w:rPr>
+                <w:rFonts w:ascii="Arial" w:hAnsi="Arial" w:eastAsia="Arial" w:cs="Arial"/>
+                <w:i w:val="false"/>
+                <w:b w:val="false"/>
+                <w:u w:val="none"/>
+                <w:vertAlign w:val="superscript"/>
+                <w:sz w:val="18"/>
+                <w:szCs w:val="18"/>
+                <w:color w:val="000000"/>
+              </w:rPr>
+              <w:t xml:space="preserve">2</w:t>
+            </w:r>
+            <w:r>
+              <w:rPr>
+                <w:rFonts w:ascii="Arial" w:hAnsi="Arial" w:eastAsia="Arial" w:cs="Arial"/>
+                <w:i w:val="false"/>
+                <w:b w:val="false"/>
+                <w:u w:val="none"/>
+                <w:sz w:val="18"/>
+                <w:szCs w:val="18"/>
+                <w:color w:val="000000"/>
+              </w:rPr>
+              <w:t xml:space="preserve">Kruskal-Wallis test (*); Chi-square test (**).</w:t>
+            </w:r>
+          </w:p>
+        </w:tc>
+      </w:tr>
+      <w:tr>
+        <w:trPr>
+          <w:trHeight w:val="360" w:hRule="auto"/>
+        </w:trPr>
+        footer 3
+        <w:tc>
+          <w:tcPr>
+            <w:gridSpan w:val="8"/>
             <w:tcBorders>
               <w:bottom w:val="single" w:sz="12" w:space="0" w:color="666666"/>
-              <w:top w:val="single" w:sz="12" w:space="0" w:color="666666"/>
+              <w:top w:val="none" w:sz="0" w:space="0" w:color="000000"/>
               <w:left w:val="none" w:sz="0" w:space="0" w:color="000000"/>
               <w:right w:val="none" w:sz="0" w:space="0" w:color="000000"/>
             </w:tcBorders>
@@ -8776,19 +10194,19 @@
                 <w:szCs w:val="18"/>
                 <w:color w:val="000000"/>
               </w:rPr>
-              <w:t xml:space="preserve">1</w:t>
-            </w:r>
-            <w:r>
-              <w:rPr>
-                <w:rFonts w:ascii="Arial" w:hAnsi="Arial" w:eastAsia="Arial" w:cs="Arial"/>
-                <w:i w:val="false"/>
-                <w:b w:val="false"/>
-                <w:u w:val="none"/>
-                <w:sz w:val="18"/>
-                <w:szCs w:val="18"/>
-                <w:color w:val="000000"/>
-              </w:rPr>
-              <w:t xml:space="preserve">Kruskal-Wallis test (*); Chi-square test (**).</w:t>
+              <w:t xml:space="preserve">3</w:t>
+            </w:r>
+            <w:r>
+              <w:rPr>
+                <w:rFonts w:ascii="Arial" w:hAnsi="Arial" w:eastAsia="Arial" w:cs="Arial"/>
+                <w:i w:val="false"/>
+                <w:b w:val="false"/>
+                <w:u w:val="none"/>
+                <w:sz w:val="18"/>
+                <w:szCs w:val="18"/>
+                <w:color w:val="000000"/>
+              </w:rPr>
+              <w:t xml:space="preserve">Benjamini &amp; Hochberg correction for multiple testing</w:t>
             </w:r>
           </w:p>
         </w:tc>

</xml_diff>